<commit_message>
Updated doc student 4
</commit_message>
<xml_diff>
--- a/reports/Student #4/04 - Requirements - Student #4.docx
+++ b/reports/Student #4/04 - Requirements - Student #4.docx
@@ -2246,7 +2246,13 @@
         </w:sdtPr>
         <w:sdtContent>
           <w:r>
-            <w:t xml:space="preserve">    </w:t>
+            <w:t xml:space="preserve"> </w:t>
+          </w:r>
+          <w:r>
+            <w:t xml:space="preserve"> X</w:t>
+          </w:r>
+          <w:r>
+            <w:t xml:space="preserve">   </w:t>
           </w:r>
         </w:sdtContent>
       </w:sdt>
@@ -2389,7 +2395,13 @@
         </w:sdtPr>
         <w:sdtContent>
           <w:r>
-            <w:t xml:space="preserve">    </w:t>
+            <w:t xml:space="preserve"> </w:t>
+          </w:r>
+          <w:r>
+            <w:t xml:space="preserve"> X</w:t>
+          </w:r>
+          <w:r>
+            <w:t xml:space="preserve">   </w:t>
           </w:r>
         </w:sdtContent>
       </w:sdt>
@@ -2517,7 +2529,13 @@
         </w:sdtPr>
         <w:sdtContent>
           <w:r>
-            <w:t xml:space="preserve">    </w:t>
+            <w:t xml:space="preserve">  </w:t>
+          </w:r>
+          <w:r>
+            <w:t>X</w:t>
+          </w:r>
+          <w:r>
+            <w:t xml:space="preserve">  </w:t>
           </w:r>
         </w:sdtContent>
       </w:sdt>
@@ -10584,9 +10602,11 @@
     <w:rsid w:val="00953D97"/>
     <w:rsid w:val="00993521"/>
     <w:rsid w:val="009D2E9D"/>
+    <w:rsid w:val="009D7127"/>
     <w:rsid w:val="009F68FD"/>
     <w:rsid w:val="00A222AC"/>
     <w:rsid w:val="00A77441"/>
+    <w:rsid w:val="00AB5D31"/>
     <w:rsid w:val="00B078C0"/>
     <w:rsid w:val="00B85114"/>
     <w:rsid w:val="00B9388C"/>

</xml_diff>

<commit_message>
Testing report + UML
</commit_message>
<xml_diff>
--- a/reports/Student #4/04 - Requirements - Student #4.docx
+++ b/reports/Student #4/04 - Requirements - Student #4.docx
@@ -608,8 +608,16 @@
                   <w:rPr>
                     <w:rFonts w:asciiTheme="majorHAnsi" w:hAnsiTheme="majorHAnsi" w:cstheme="majorHAnsi"/>
                   </w:rPr>
-                  <w:t>Sevilla February 17, 2025</w:t>
+                  <w:t xml:space="preserve">Sevilla February 17, </w:t>
                 </w:r>
+                <w:proofErr w:type="gramStart"/>
+                <w:r>
+                  <w:rPr>
+                    <w:rFonts w:asciiTheme="majorHAnsi" w:hAnsiTheme="majorHAnsi" w:cstheme="majorHAnsi"/>
+                  </w:rPr>
+                  <w:t>2025</w:t>
+                </w:r>
+                <w:proofErr w:type="gramEnd"/>
                 <w:r>
                   <w:rPr>
                     <w:rFonts w:asciiTheme="majorHAnsi" w:hAnsiTheme="majorHAnsi" w:cstheme="majorHAnsi"/>
@@ -2620,7 +2628,13 @@
         </w:sdtPr>
         <w:sdtContent>
           <w:r>
-            <w:t xml:space="preserve">    </w:t>
+            <w:t xml:space="preserve"> </w:t>
+          </w:r>
+          <w:r>
+            <w:t xml:space="preserve"> X</w:t>
+          </w:r>
+          <w:r>
+            <w:t xml:space="preserve">  </w:t>
           </w:r>
         </w:sdtContent>
       </w:sdt>
@@ -2745,7 +2759,13 @@
         </w:sdtPr>
         <w:sdtContent>
           <w:r>
-            <w:t xml:space="preserve">    </w:t>
+            <w:t xml:space="preserve">  </w:t>
+          </w:r>
+          <w:r>
+            <w:t>X</w:t>
+          </w:r>
+          <w:r>
+            <w:t xml:space="preserve">  </w:t>
           </w:r>
         </w:sdtContent>
       </w:sdt>
@@ -2796,7 +2816,13 @@
         </w:sdtPr>
         <w:sdtContent>
           <w:r>
-            <w:t xml:space="preserve">    </w:t>
+            <w:t xml:space="preserve">  </w:t>
+          </w:r>
+          <w:r>
+            <w:t>X</w:t>
+          </w:r>
+          <w:r>
+            <w:t xml:space="preserve">  </w:t>
           </w:r>
         </w:sdtContent>
       </w:sdt>
@@ -2832,7 +2858,13 @@
         </w:sdtPr>
         <w:sdtContent>
           <w:r>
-            <w:t xml:space="preserve">    </w:t>
+            <w:t xml:space="preserve">  </w:t>
+          </w:r>
+          <w:r>
+            <w:t>X</w:t>
+          </w:r>
+          <w:r>
+            <w:t xml:space="preserve">  </w:t>
           </w:r>
         </w:sdtContent>
       </w:sdt>
@@ -3301,7 +3333,19 @@
             <w:rPr>
               <w:lang w:val="en-US"/>
             </w:rPr>
-            <w:t xml:space="preserve">    </w:t>
+            <w:t xml:space="preserve">  </w:t>
+          </w:r>
+          <w:r>
+            <w:rPr>
+              <w:lang w:val="en-US"/>
+            </w:rPr>
+            <w:t>X</w:t>
+          </w:r>
+          <w:r>
+            <w:rPr>
+              <w:lang w:val="en-US"/>
+            </w:rPr>
+            <w:t xml:space="preserve">  </w:t>
           </w:r>
         </w:sdtContent>
       </w:sdt>
@@ -3630,7 +3674,13 @@
         </w:sdtPr>
         <w:sdtContent>
           <w:r>
-            <w:t xml:space="preserve">    </w:t>
+            <w:t xml:space="preserve">  </w:t>
+          </w:r>
+          <w:r>
+            <w:t>X</w:t>
+          </w:r>
+          <w:r>
+            <w:t xml:space="preserve">  </w:t>
           </w:r>
         </w:sdtContent>
       </w:sdt>
@@ -3698,7 +3748,13 @@
         </w:sdtPr>
         <w:sdtContent>
           <w:r>
-            <w:t xml:space="preserve">    </w:t>
+            <w:t xml:space="preserve"> </w:t>
+          </w:r>
+          <w:r>
+            <w:t>X</w:t>
+          </w:r>
+          <w:r>
+            <w:t xml:space="preserve">   </w:t>
           </w:r>
         </w:sdtContent>
       </w:sdt>
@@ -3774,7 +3830,13 @@
         </w:sdtPr>
         <w:sdtContent>
           <w:r>
-            <w:t xml:space="preserve">    </w:t>
+            <w:t xml:space="preserve">  </w:t>
+          </w:r>
+          <w:r>
+            <w:t>X</w:t>
+          </w:r>
+          <w:r>
+            <w:t xml:space="preserve">  </w:t>
           </w:r>
         </w:sdtContent>
       </w:sdt>
@@ -3842,7 +3904,13 @@
         </w:sdtPr>
         <w:sdtContent>
           <w:r>
-            <w:t xml:space="preserve">    </w:t>
+            <w:t xml:space="preserve"> </w:t>
+          </w:r>
+          <w:r>
+            <w:t>X</w:t>
+          </w:r>
+          <w:r>
+            <w:t xml:space="preserve">   </w:t>
           </w:r>
         </w:sdtContent>
       </w:sdt>
@@ -10589,14 +10657,17 @@
     <w:rsid w:val="001B7228"/>
     <w:rsid w:val="002128F8"/>
     <w:rsid w:val="002150E0"/>
+    <w:rsid w:val="00313ADB"/>
     <w:rsid w:val="00362E40"/>
     <w:rsid w:val="003936CA"/>
+    <w:rsid w:val="00465894"/>
     <w:rsid w:val="004C7734"/>
     <w:rsid w:val="004D7778"/>
     <w:rsid w:val="004F2A33"/>
     <w:rsid w:val="005E7E6F"/>
     <w:rsid w:val="00635F6F"/>
     <w:rsid w:val="0073694E"/>
+    <w:rsid w:val="007D0856"/>
     <w:rsid w:val="008B1087"/>
     <w:rsid w:val="008D6165"/>
     <w:rsid w:val="00953D97"/>
@@ -10627,6 +10698,7 @@
     <w:rsid w:val="00FA7306"/>
     <w:rsid w:val="00FB072E"/>
     <w:rsid w:val="00FC6CD0"/>
+    <w:rsid w:val="00FD287D"/>
     <w:rsid w:val="00FD2B7E"/>
     <w:rsid w:val="00FD6EBE"/>
     <w:rsid w:val="00FE6BFD"/>

</xml_diff>